<commit_message>
Update project delivery report with latest DOCX and PDF versions.
</commit_message>
<xml_diff>
--- a/PrgDen_Proje_Teslim_Raporu_MeryemKoc.docx
+++ b/PrgDen_Proje_Teslim_Raporu_MeryemKoc.docx
@@ -274,7 +274,7 @@
           <w:sz w:val="24"/>
           <w:szCs w:val="24"/>
         </w:rPr>
-        <w:t>Hazırlayan: Meryem KOÇ — 245B4003</w:t>
+        <w:t xml:space="preserve">Hazırlayan: Meryem KOÇ </w:t>
       </w:r>
     </w:p>
     <w:p>
@@ -2532,12 +2532,6 @@
         <w:gridCol w:w="5826"/>
       </w:tblGrid>
       <w:tr>
-        <w:tblPrEx>
-          <w:tblCellMar>
-            <w:top w:w="0" w:type="dxa"/>
-            <w:bottom w:w="0" w:type="dxa"/>
-          </w:tblCellMar>
-        </w:tblPrEx>
         <w:trPr>
           <w:tblHeader/>
         </w:trPr>
@@ -2603,12 +2597,6 @@
         </w:tc>
       </w:tr>
       <w:tr>
-        <w:tblPrEx>
-          <w:tblCellMar>
-            <w:top w:w="0" w:type="dxa"/>
-            <w:bottom w:w="0" w:type="dxa"/>
-          </w:tblCellMar>
-        </w:tblPrEx>
         <w:tc>
           <w:tcPr>
             <w:tcW w:w="3200" w:type="dxa"/>
@@ -2674,12 +2662,6 @@
         </w:tc>
       </w:tr>
       <w:tr>
-        <w:tblPrEx>
-          <w:tblCellMar>
-            <w:top w:w="0" w:type="dxa"/>
-            <w:bottom w:w="0" w:type="dxa"/>
-          </w:tblCellMar>
-        </w:tblPrEx>
         <w:tc>
           <w:tcPr>
             <w:tcW w:w="3200" w:type="dxa"/>
@@ -2745,12 +2727,6 @@
         </w:tc>
       </w:tr>
       <w:tr>
-        <w:tblPrEx>
-          <w:tblCellMar>
-            <w:top w:w="0" w:type="dxa"/>
-            <w:bottom w:w="0" w:type="dxa"/>
-          </w:tblCellMar>
-        </w:tblPrEx>
         <w:tc>
           <w:tcPr>
             <w:tcW w:w="3200" w:type="dxa"/>
@@ -2832,12 +2808,6 @@
         </w:tc>
       </w:tr>
       <w:tr>
-        <w:tblPrEx>
-          <w:tblCellMar>
-            <w:top w:w="0" w:type="dxa"/>
-            <w:bottom w:w="0" w:type="dxa"/>
-          </w:tblCellMar>
-        </w:tblPrEx>
         <w:tc>
           <w:tcPr>
             <w:tcW w:w="3200" w:type="dxa"/>
@@ -2942,12 +2912,6 @@
         </w:tc>
       </w:tr>
       <w:tr>
-        <w:tblPrEx>
-          <w:tblCellMar>
-            <w:top w:w="0" w:type="dxa"/>
-            <w:bottom w:w="0" w:type="dxa"/>
-          </w:tblCellMar>
-        </w:tblPrEx>
         <w:tc>
           <w:tcPr>
             <w:tcW w:w="3200" w:type="dxa"/>
@@ -3029,12 +2993,6 @@
         </w:tc>
       </w:tr>
       <w:tr>
-        <w:tblPrEx>
-          <w:tblCellMar>
-            <w:top w:w="0" w:type="dxa"/>
-            <w:bottom w:w="0" w:type="dxa"/>
-          </w:tblCellMar>
-        </w:tblPrEx>
         <w:tc>
           <w:tcPr>
             <w:tcW w:w="3200" w:type="dxa"/>
@@ -3196,14 +3154,9 @@
       <w:r>
         <w:t xml:space="preserve"> </w:t>
       </w:r>
-      <w:proofErr w:type="gramStart"/>
       <w:r>
         <w:lastRenderedPageBreak/>
-        <w:t>çalıştığından</w:t>
-      </w:r>
-      <w:proofErr w:type="gramEnd"/>
-      <w:r>
-        <w:t xml:space="preserve"> (GPIO LOW iken röle çeker) merdiven diyagramında fiziksel çıkışlar normalde kapalı (NC) kontak üzerinden sürülmüştür; bu tasarım kararı Bölüm 4.4'te ayrıntılandırılmıştır.</w:t>
+        <w:t>çalıştığından (GPIO LOW iken röle çeker) merdiven diyagramında fiziksel çıkışlar normalde kapalı (NC) kontak üzerinden sürülmüştür; bu tasarım kararı Bölüm 4.4'te ayrıntılandırılmıştır.</w:t>
       </w:r>
     </w:p>
     <w:p>
@@ -3268,12 +3221,6 @@
         <w:gridCol w:w="3226"/>
       </w:tblGrid>
       <w:tr>
-        <w:tblPrEx>
-          <w:tblCellMar>
-            <w:top w:w="0" w:type="dxa"/>
-            <w:bottom w:w="0" w:type="dxa"/>
-          </w:tblCellMar>
-        </w:tblPrEx>
         <w:trPr>
           <w:tblHeader/>
         </w:trPr>
@@ -3411,12 +3358,6 @@
         </w:tc>
       </w:tr>
       <w:tr>
-        <w:tblPrEx>
-          <w:tblCellMar>
-            <w:top w:w="0" w:type="dxa"/>
-            <w:bottom w:w="0" w:type="dxa"/>
-          </w:tblCellMar>
-        </w:tblPrEx>
         <w:tc>
           <w:tcPr>
             <w:tcW w:w="2600" w:type="dxa"/>
@@ -3527,12 +3468,6 @@
         </w:tc>
       </w:tr>
       <w:tr>
-        <w:tblPrEx>
-          <w:tblCellMar>
-            <w:top w:w="0" w:type="dxa"/>
-            <w:bottom w:w="0" w:type="dxa"/>
-          </w:tblCellMar>
-        </w:tblPrEx>
         <w:tc>
           <w:tcPr>
             <w:tcW w:w="2600" w:type="dxa"/>
@@ -3643,12 +3578,6 @@
         </w:tc>
       </w:tr>
       <w:tr>
-        <w:tblPrEx>
-          <w:tblCellMar>
-            <w:top w:w="0" w:type="dxa"/>
-            <w:bottom w:w="0" w:type="dxa"/>
-          </w:tblCellMar>
-        </w:tblPrEx>
         <w:tc>
           <w:tcPr>
             <w:tcW w:w="2600" w:type="dxa"/>
@@ -3759,12 +3688,6 @@
         </w:tc>
       </w:tr>
       <w:tr>
-        <w:tblPrEx>
-          <w:tblCellMar>
-            <w:top w:w="0" w:type="dxa"/>
-            <w:bottom w:w="0" w:type="dxa"/>
-          </w:tblCellMar>
-        </w:tblPrEx>
         <w:tc>
           <w:tcPr>
             <w:tcW w:w="2600" w:type="dxa"/>
@@ -3875,12 +3798,6 @@
         </w:tc>
       </w:tr>
       <w:tr>
-        <w:tblPrEx>
-          <w:tblCellMar>
-            <w:top w:w="0" w:type="dxa"/>
-            <w:bottom w:w="0" w:type="dxa"/>
-          </w:tblCellMar>
-        </w:tblPrEx>
         <w:tc>
           <w:tcPr>
             <w:tcW w:w="2600" w:type="dxa"/>
@@ -4078,12 +3995,6 @@
         <w:gridCol w:w="2826"/>
       </w:tblGrid>
       <w:tr>
-        <w:tblPrEx>
-          <w:tblCellMar>
-            <w:top w:w="0" w:type="dxa"/>
-            <w:bottom w:w="0" w:type="dxa"/>
-          </w:tblCellMar>
-        </w:tblPrEx>
         <w:trPr>
           <w:tblHeader/>
         </w:trPr>
@@ -4221,12 +4132,6 @@
         </w:tc>
       </w:tr>
       <w:tr>
-        <w:tblPrEx>
-          <w:tblCellMar>
-            <w:top w:w="0" w:type="dxa"/>
-            <w:bottom w:w="0" w:type="dxa"/>
-          </w:tblCellMar>
-        </w:tblPrEx>
         <w:tc>
           <w:tcPr>
             <w:tcW w:w="2600" w:type="dxa"/>
@@ -4337,12 +4242,6 @@
         </w:tc>
       </w:tr>
       <w:tr>
-        <w:tblPrEx>
-          <w:tblCellMar>
-            <w:top w:w="0" w:type="dxa"/>
-            <w:bottom w:w="0" w:type="dxa"/>
-          </w:tblCellMar>
-        </w:tblPrEx>
         <w:tc>
           <w:tcPr>
             <w:tcW w:w="2600" w:type="dxa"/>
@@ -4453,12 +4352,6 @@
         </w:tc>
       </w:tr>
       <w:tr>
-        <w:tblPrEx>
-          <w:tblCellMar>
-            <w:top w:w="0" w:type="dxa"/>
-            <w:bottom w:w="0" w:type="dxa"/>
-          </w:tblCellMar>
-        </w:tblPrEx>
         <w:tc>
           <w:tcPr>
             <w:tcW w:w="2600" w:type="dxa"/>
@@ -4569,12 +4462,6 @@
         </w:tc>
       </w:tr>
       <w:tr>
-        <w:tblPrEx>
-          <w:tblCellMar>
-            <w:top w:w="0" w:type="dxa"/>
-            <w:bottom w:w="0" w:type="dxa"/>
-          </w:tblCellMar>
-        </w:tblPrEx>
         <w:tc>
           <w:tcPr>
             <w:tcW w:w="2600" w:type="dxa"/>
@@ -4895,12 +4782,6 @@
         <w:gridCol w:w="3576"/>
       </w:tblGrid>
       <w:tr>
-        <w:tblPrEx>
-          <w:tblCellMar>
-            <w:top w:w="0" w:type="dxa"/>
-            <w:bottom w:w="0" w:type="dxa"/>
-          </w:tblCellMar>
-        </w:tblPrEx>
         <w:trPr>
           <w:tblHeader/>
         </w:trPr>
@@ -5026,12 +4907,6 @@
         </w:tc>
       </w:tr>
       <w:tr>
-        <w:tblPrEx>
-          <w:tblCellMar>
-            <w:top w:w="0" w:type="dxa"/>
-            <w:bottom w:w="0" w:type="dxa"/>
-          </w:tblCellMar>
-        </w:tblPrEx>
         <w:tc>
           <w:tcPr>
             <w:tcW w:w="2900" w:type="dxa"/>
@@ -5144,12 +5019,6 @@
         </w:tc>
       </w:tr>
       <w:tr>
-        <w:tblPrEx>
-          <w:tblCellMar>
-            <w:top w:w="0" w:type="dxa"/>
-            <w:bottom w:w="0" w:type="dxa"/>
-          </w:tblCellMar>
-        </w:tblPrEx>
         <w:tc>
           <w:tcPr>
             <w:tcW w:w="2900" w:type="dxa"/>
@@ -5262,12 +5131,6 @@
         </w:tc>
       </w:tr>
       <w:tr>
-        <w:tblPrEx>
-          <w:tblCellMar>
-            <w:top w:w="0" w:type="dxa"/>
-            <w:bottom w:w="0" w:type="dxa"/>
-          </w:tblCellMar>
-        </w:tblPrEx>
         <w:tc>
           <w:tcPr>
             <w:tcW w:w="2900" w:type="dxa"/>
@@ -5380,12 +5243,6 @@
         </w:tc>
       </w:tr>
       <w:tr>
-        <w:tblPrEx>
-          <w:tblCellMar>
-            <w:top w:w="0" w:type="dxa"/>
-            <w:bottom w:w="0" w:type="dxa"/>
-          </w:tblCellMar>
-        </w:tblPrEx>
         <w:tc>
           <w:tcPr>
             <w:tcW w:w="2900" w:type="dxa"/>
@@ -5498,12 +5355,6 @@
         </w:tc>
       </w:tr>
       <w:tr>
-        <w:tblPrEx>
-          <w:tblCellMar>
-            <w:top w:w="0" w:type="dxa"/>
-            <w:bottom w:w="0" w:type="dxa"/>
-          </w:tblCellMar>
-        </w:tblPrEx>
         <w:tc>
           <w:tcPr>
             <w:tcW w:w="2900" w:type="dxa"/>
@@ -5630,12 +5481,6 @@
         </w:tc>
       </w:tr>
       <w:tr>
-        <w:tblPrEx>
-          <w:tblCellMar>
-            <w:top w:w="0" w:type="dxa"/>
-            <w:bottom w:w="0" w:type="dxa"/>
-          </w:tblCellMar>
-        </w:tblPrEx>
         <w:tc>
           <w:tcPr>
             <w:tcW w:w="2900" w:type="dxa"/>
@@ -5746,12 +5591,6 @@
         </w:tc>
       </w:tr>
       <w:tr>
-        <w:tblPrEx>
-          <w:tblCellMar>
-            <w:top w:w="0" w:type="dxa"/>
-            <w:bottom w:w="0" w:type="dxa"/>
-          </w:tblCellMar>
-        </w:tblPrEx>
         <w:tc>
           <w:tcPr>
             <w:tcW w:w="2900" w:type="dxa"/>
@@ -5878,12 +5717,6 @@
         </w:tc>
       </w:tr>
       <w:tr>
-        <w:tblPrEx>
-          <w:tblCellMar>
-            <w:top w:w="0" w:type="dxa"/>
-            <w:bottom w:w="0" w:type="dxa"/>
-          </w:tblCellMar>
-        </w:tblPrEx>
         <w:tc>
           <w:tcPr>
             <w:tcW w:w="2900" w:type="dxa"/>
@@ -6010,12 +5843,6 @@
         </w:tc>
       </w:tr>
       <w:tr>
-        <w:tblPrEx>
-          <w:tblCellMar>
-            <w:top w:w="0" w:type="dxa"/>
-            <w:bottom w:w="0" w:type="dxa"/>
-          </w:tblCellMar>
-        </w:tblPrEx>
         <w:tc>
           <w:tcPr>
             <w:tcW w:w="2900" w:type="dxa"/>
@@ -6142,12 +5969,6 @@
         </w:tc>
       </w:tr>
       <w:tr>
-        <w:tblPrEx>
-          <w:tblCellMar>
-            <w:top w:w="0" w:type="dxa"/>
-            <w:bottom w:w="0" w:type="dxa"/>
-          </w:tblCellMar>
-        </w:tblPrEx>
         <w:tc>
           <w:tcPr>
             <w:tcW w:w="2900" w:type="dxa"/>
@@ -6274,12 +6095,6 @@
         </w:tc>
       </w:tr>
       <w:tr>
-        <w:tblPrEx>
-          <w:tblCellMar>
-            <w:top w:w="0" w:type="dxa"/>
-            <w:bottom w:w="0" w:type="dxa"/>
-          </w:tblCellMar>
-        </w:tblPrEx>
         <w:tc>
           <w:tcPr>
             <w:tcW w:w="2900" w:type="dxa"/>
@@ -6392,12 +6207,6 @@
         </w:tc>
       </w:tr>
       <w:tr>
-        <w:tblPrEx>
-          <w:tblCellMar>
-            <w:top w:w="0" w:type="dxa"/>
-            <w:bottom w:w="0" w:type="dxa"/>
-          </w:tblCellMar>
-        </w:tblPrEx>
         <w:tc>
           <w:tcPr>
             <w:tcW w:w="2900" w:type="dxa"/>
@@ -6510,12 +6319,6 @@
         </w:tc>
       </w:tr>
       <w:tr>
-        <w:tblPrEx>
-          <w:tblCellMar>
-            <w:top w:w="0" w:type="dxa"/>
-            <w:bottom w:w="0" w:type="dxa"/>
-          </w:tblCellMar>
-        </w:tblPrEx>
         <w:tc>
           <w:tcPr>
             <w:tcW w:w="2900" w:type="dxa"/>
@@ -6628,12 +6431,6 @@
         </w:tc>
       </w:tr>
       <w:tr>
-        <w:tblPrEx>
-          <w:tblCellMar>
-            <w:top w:w="0" w:type="dxa"/>
-            <w:bottom w:w="0" w:type="dxa"/>
-          </w:tblCellMar>
-        </w:tblPrEx>
         <w:tc>
           <w:tcPr>
             <w:tcW w:w="2900" w:type="dxa"/>
@@ -6906,12 +6703,6 @@
         <w:gridCol w:w="3326"/>
       </w:tblGrid>
       <w:tr>
-        <w:tblPrEx>
-          <w:tblCellMar>
-            <w:top w:w="0" w:type="dxa"/>
-            <w:bottom w:w="0" w:type="dxa"/>
-          </w:tblCellMar>
-        </w:tblPrEx>
         <w:trPr>
           <w:tblHeader/>
         </w:trPr>
@@ -7007,12 +6798,6 @@
         </w:tc>
       </w:tr>
       <w:tr>
-        <w:tblPrEx>
-          <w:tblCellMar>
-            <w:top w:w="0" w:type="dxa"/>
-            <w:bottom w:w="0" w:type="dxa"/>
-          </w:tblCellMar>
-        </w:tblPrEx>
         <w:tc>
           <w:tcPr>
             <w:tcW w:w="3000" w:type="dxa"/>
@@ -7096,12 +6881,6 @@
         </w:tc>
       </w:tr>
       <w:tr>
-        <w:tblPrEx>
-          <w:tblCellMar>
-            <w:top w:w="0" w:type="dxa"/>
-            <w:bottom w:w="0" w:type="dxa"/>
-          </w:tblCellMar>
-        </w:tblPrEx>
         <w:tc>
           <w:tcPr>
             <w:tcW w:w="3000" w:type="dxa"/>
@@ -7185,12 +6964,6 @@
         </w:tc>
       </w:tr>
       <w:tr>
-        <w:tblPrEx>
-          <w:tblCellMar>
-            <w:top w:w="0" w:type="dxa"/>
-            <w:bottom w:w="0" w:type="dxa"/>
-          </w:tblCellMar>
-        </w:tblPrEx>
         <w:tc>
           <w:tcPr>
             <w:tcW w:w="3000" w:type="dxa"/>
@@ -7274,12 +7047,6 @@
         </w:tc>
       </w:tr>
       <w:tr>
-        <w:tblPrEx>
-          <w:tblCellMar>
-            <w:top w:w="0" w:type="dxa"/>
-            <w:bottom w:w="0" w:type="dxa"/>
-          </w:tblCellMar>
-        </w:tblPrEx>
         <w:tc>
           <w:tcPr>
             <w:tcW w:w="3000" w:type="dxa"/>
@@ -7363,12 +7130,6 @@
         </w:tc>
       </w:tr>
       <w:tr>
-        <w:tblPrEx>
-          <w:tblCellMar>
-            <w:top w:w="0" w:type="dxa"/>
-            <w:bottom w:w="0" w:type="dxa"/>
-          </w:tblCellMar>
-        </w:tblPrEx>
         <w:tc>
           <w:tcPr>
             <w:tcW w:w="3000" w:type="dxa"/>
@@ -9732,12 +9493,6 @@
         <w:gridCol w:w="3576"/>
       </w:tblGrid>
       <w:tr>
-        <w:tblPrEx>
-          <w:tblCellMar>
-            <w:top w:w="0" w:type="dxa"/>
-            <w:bottom w:w="0" w:type="dxa"/>
-          </w:tblCellMar>
-        </w:tblPrEx>
         <w:trPr>
           <w:tblHeader/>
         </w:trPr>
@@ -9865,12 +9620,6 @@
         </w:tc>
       </w:tr>
       <w:tr>
-        <w:tblPrEx>
-          <w:tblCellMar>
-            <w:top w:w="0" w:type="dxa"/>
-            <w:bottom w:w="0" w:type="dxa"/>
-          </w:tblCellMar>
-        </w:tblPrEx>
         <w:tc>
           <w:tcPr>
             <w:tcW w:w="3100" w:type="dxa"/>
@@ -9997,12 +9746,6 @@
         </w:tc>
       </w:tr>
       <w:tr>
-        <w:tblPrEx>
-          <w:tblCellMar>
-            <w:top w:w="0" w:type="dxa"/>
-            <w:bottom w:w="0" w:type="dxa"/>
-          </w:tblCellMar>
-        </w:tblPrEx>
         <w:tc>
           <w:tcPr>
             <w:tcW w:w="3100" w:type="dxa"/>
@@ -10129,12 +9872,6 @@
         </w:tc>
       </w:tr>
       <w:tr>
-        <w:tblPrEx>
-          <w:tblCellMar>
-            <w:top w:w="0" w:type="dxa"/>
-            <w:bottom w:w="0" w:type="dxa"/>
-          </w:tblCellMar>
-        </w:tblPrEx>
         <w:tc>
           <w:tcPr>
             <w:tcW w:w="3100" w:type="dxa"/>
@@ -10261,12 +9998,6 @@
         </w:tc>
       </w:tr>
       <w:tr>
-        <w:tblPrEx>
-          <w:tblCellMar>
-            <w:top w:w="0" w:type="dxa"/>
-            <w:bottom w:w="0" w:type="dxa"/>
-          </w:tblCellMar>
-        </w:tblPrEx>
         <w:tc>
           <w:tcPr>
             <w:tcW w:w="3100" w:type="dxa"/>
@@ -10393,12 +10124,6 @@
         </w:tc>
       </w:tr>
       <w:tr>
-        <w:tblPrEx>
-          <w:tblCellMar>
-            <w:top w:w="0" w:type="dxa"/>
-            <w:bottom w:w="0" w:type="dxa"/>
-          </w:tblCellMar>
-        </w:tblPrEx>
         <w:tc>
           <w:tcPr>
             <w:tcW w:w="3100" w:type="dxa"/>
@@ -10509,12 +10234,6 @@
         </w:tc>
       </w:tr>
       <w:tr>
-        <w:tblPrEx>
-          <w:tblCellMar>
-            <w:top w:w="0" w:type="dxa"/>
-            <w:bottom w:w="0" w:type="dxa"/>
-          </w:tblCellMar>
-        </w:tblPrEx>
         <w:tc>
           <w:tcPr>
             <w:tcW w:w="3100" w:type="dxa"/>
@@ -10625,12 +10344,6 @@
         </w:tc>
       </w:tr>
       <w:tr>
-        <w:tblPrEx>
-          <w:tblCellMar>
-            <w:top w:w="0" w:type="dxa"/>
-            <w:bottom w:w="0" w:type="dxa"/>
-          </w:tblCellMar>
-        </w:tblPrEx>
         <w:tc>
           <w:tcPr>
             <w:tcW w:w="3100" w:type="dxa"/>
@@ -10741,12 +10454,6 @@
         </w:tc>
       </w:tr>
       <w:tr>
-        <w:tblPrEx>
-          <w:tblCellMar>
-            <w:top w:w="0" w:type="dxa"/>
-            <w:bottom w:w="0" w:type="dxa"/>
-          </w:tblCellMar>
-        </w:tblPrEx>
         <w:tc>
           <w:tcPr>
             <w:tcW w:w="3100" w:type="dxa"/>
@@ -10857,12 +10564,6 @@
         </w:tc>
       </w:tr>
       <w:tr>
-        <w:tblPrEx>
-          <w:tblCellMar>
-            <w:top w:w="0" w:type="dxa"/>
-            <w:bottom w:w="0" w:type="dxa"/>
-          </w:tblCellMar>
-        </w:tblPrEx>
         <w:tc>
           <w:tcPr>
             <w:tcW w:w="3100" w:type="dxa"/>
@@ -11005,12 +10706,6 @@
         </w:tc>
       </w:tr>
       <w:tr>
-        <w:tblPrEx>
-          <w:tblCellMar>
-            <w:top w:w="0" w:type="dxa"/>
-            <w:bottom w:w="0" w:type="dxa"/>
-          </w:tblCellMar>
-        </w:tblPrEx>
         <w:tc>
           <w:tcPr>
             <w:tcW w:w="3100" w:type="dxa"/>
@@ -11153,12 +10848,6 @@
         </w:tc>
       </w:tr>
       <w:tr>
-        <w:tblPrEx>
-          <w:tblCellMar>
-            <w:top w:w="0" w:type="dxa"/>
-            <w:bottom w:w="0" w:type="dxa"/>
-          </w:tblCellMar>
-        </w:tblPrEx>
         <w:tc>
           <w:tcPr>
             <w:tcW w:w="3100" w:type="dxa"/>
@@ -11301,12 +10990,6 @@
         </w:tc>
       </w:tr>
       <w:tr>
-        <w:tblPrEx>
-          <w:tblCellMar>
-            <w:top w:w="0" w:type="dxa"/>
-            <w:bottom w:w="0" w:type="dxa"/>
-          </w:tblCellMar>
-        </w:tblPrEx>
         <w:tc>
           <w:tcPr>
             <w:tcW w:w="3100" w:type="dxa"/>
@@ -11449,12 +11132,6 @@
         </w:tc>
       </w:tr>
       <w:tr>
-        <w:tblPrEx>
-          <w:tblCellMar>
-            <w:top w:w="0" w:type="dxa"/>
-            <w:bottom w:w="0" w:type="dxa"/>
-          </w:tblCellMar>
-        </w:tblPrEx>
         <w:tc>
           <w:tcPr>
             <w:tcW w:w="3100" w:type="dxa"/>
@@ -12546,12 +12223,6 @@
         <w:gridCol w:w="5500"/>
       </w:tblGrid>
       <w:tr>
-        <w:tblPrEx>
-          <w:tblCellMar>
-            <w:top w:w="0" w:type="dxa"/>
-            <w:bottom w:w="0" w:type="dxa"/>
-          </w:tblCellMar>
-        </w:tblPrEx>
         <w:trPr>
           <w:tblHeader/>
         </w:trPr>
@@ -12617,12 +12288,6 @@
         </w:tc>
       </w:tr>
       <w:tr>
-        <w:tblPrEx>
-          <w:tblCellMar>
-            <w:top w:w="0" w:type="dxa"/>
-            <w:bottom w:w="0" w:type="dxa"/>
-          </w:tblCellMar>
-        </w:tblPrEx>
         <w:tc>
           <w:tcPr>
             <w:tcW w:w="3526" w:type="dxa"/>
@@ -12727,12 +12392,6 @@
         </w:tc>
       </w:tr>
       <w:tr>
-        <w:tblPrEx>
-          <w:tblCellMar>
-            <w:top w:w="0" w:type="dxa"/>
-            <w:bottom w:w="0" w:type="dxa"/>
-          </w:tblCellMar>
-        </w:tblPrEx>
         <w:tc>
           <w:tcPr>
             <w:tcW w:w="3526" w:type="dxa"/>
@@ -12805,12 +12464,6 @@
         </w:tc>
       </w:tr>
       <w:tr>
-        <w:tblPrEx>
-          <w:tblCellMar>
-            <w:top w:w="0" w:type="dxa"/>
-            <w:bottom w:w="0" w:type="dxa"/>
-          </w:tblCellMar>
-        </w:tblPrEx>
         <w:tc>
           <w:tcPr>
             <w:tcW w:w="3526" w:type="dxa"/>
@@ -12915,12 +12568,6 @@
         </w:tc>
       </w:tr>
       <w:tr>
-        <w:tblPrEx>
-          <w:tblCellMar>
-            <w:top w:w="0" w:type="dxa"/>
-            <w:bottom w:w="0" w:type="dxa"/>
-          </w:tblCellMar>
-        </w:tblPrEx>
         <w:tc>
           <w:tcPr>
             <w:tcW w:w="3526" w:type="dxa"/>
@@ -13020,12 +12667,6 @@
         </w:tc>
       </w:tr>
       <w:tr>
-        <w:tblPrEx>
-          <w:tblCellMar>
-            <w:top w:w="0" w:type="dxa"/>
-            <w:bottom w:w="0" w:type="dxa"/>
-          </w:tblCellMar>
-        </w:tblPrEx>
         <w:tc>
           <w:tcPr>
             <w:tcW w:w="3526" w:type="dxa"/>
@@ -13114,12 +12755,6 @@
         </w:tc>
       </w:tr>
       <w:tr>
-        <w:tblPrEx>
-          <w:tblCellMar>
-            <w:top w:w="0" w:type="dxa"/>
-            <w:bottom w:w="0" w:type="dxa"/>
-          </w:tblCellMar>
-        </w:tblPrEx>
         <w:tc>
           <w:tcPr>
             <w:tcW w:w="3526" w:type="dxa"/>
@@ -13194,12 +12829,6 @@
         </w:tc>
       </w:tr>
       <w:tr>
-        <w:tblPrEx>
-          <w:tblCellMar>
-            <w:top w:w="0" w:type="dxa"/>
-            <w:bottom w:w="0" w:type="dxa"/>
-          </w:tblCellMar>
-        </w:tblPrEx>
         <w:tc>
           <w:tcPr>
             <w:tcW w:w="3526" w:type="dxa"/>
@@ -13274,12 +12903,6 @@
         </w:tc>
       </w:tr>
       <w:tr>
-        <w:tblPrEx>
-          <w:tblCellMar>
-            <w:top w:w="0" w:type="dxa"/>
-            <w:bottom w:w="0" w:type="dxa"/>
-          </w:tblCellMar>
-        </w:tblPrEx>
         <w:tc>
           <w:tcPr>
             <w:tcW w:w="3526" w:type="dxa"/>
@@ -13345,12 +12968,6 @@
         </w:tc>
       </w:tr>
       <w:tr>
-        <w:tblPrEx>
-          <w:tblCellMar>
-            <w:top w:w="0" w:type="dxa"/>
-            <w:bottom w:w="0" w:type="dxa"/>
-          </w:tblCellMar>
-        </w:tblPrEx>
         <w:tc>
           <w:tcPr>
             <w:tcW w:w="3526" w:type="dxa"/>
@@ -13432,12 +13049,6 @@
         </w:tc>
       </w:tr>
       <w:tr>
-        <w:tblPrEx>
-          <w:tblCellMar>
-            <w:top w:w="0" w:type="dxa"/>
-            <w:bottom w:w="0" w:type="dxa"/>
-          </w:tblCellMar>
-        </w:tblPrEx>
         <w:tc>
           <w:tcPr>
             <w:tcW w:w="3526" w:type="dxa"/>
@@ -13494,12 +13105,6 @@
         </w:tc>
       </w:tr>
       <w:tr>
-        <w:tblPrEx>
-          <w:tblCellMar>
-            <w:top w:w="0" w:type="dxa"/>
-            <w:bottom w:w="0" w:type="dxa"/>
-          </w:tblCellMar>
-        </w:tblPrEx>
         <w:tc>
           <w:tcPr>
             <w:tcW w:w="3526" w:type="dxa"/>
@@ -14058,7 +13663,7 @@
         <w:sz w:val="16"/>
         <w:szCs w:val="16"/>
       </w:rPr>
-      <w:t>Programlanabilir Denetleyiciler — Proje Teslim Raporu — Meryem Koç 245B4003</w:t>
+      <w:t xml:space="preserve">Programlanabilir Denetleyiciler — Proje Teslim Raporu — Meryem Koç </w:t>
     </w:r>
   </w:p>
 </w:hdr>
@@ -14849,6 +14454,48 @@
       <w:ind w:left="210"/>
     </w:pPr>
   </w:style>
+  <w:style w:type="paragraph" w:styleId="stBilgi">
+    <w:name w:val="header"/>
+    <w:basedOn w:val="Normal"/>
+    <w:link w:val="stBilgiChar"/>
+    <w:uiPriority w:val="99"/>
+    <w:unhideWhenUsed/>
+    <w:rsid w:val="00A90511"/>
+    <w:pPr>
+      <w:tabs>
+        <w:tab w:val="center" w:pos="4536"/>
+        <w:tab w:val="right" w:pos="9072"/>
+      </w:tabs>
+    </w:pPr>
+  </w:style>
+  <w:style w:type="character" w:customStyle="1" w:styleId="stBilgiChar">
+    <w:name w:val="Üst Bilgi Char"/>
+    <w:basedOn w:val="VarsaylanParagrafYazTipi"/>
+    <w:link w:val="stBilgi"/>
+    <w:uiPriority w:val="99"/>
+    <w:rsid w:val="00A90511"/>
+  </w:style>
+  <w:style w:type="paragraph" w:styleId="AltBilgi">
+    <w:name w:val="footer"/>
+    <w:basedOn w:val="Normal"/>
+    <w:link w:val="AltBilgiChar"/>
+    <w:uiPriority w:val="99"/>
+    <w:unhideWhenUsed/>
+    <w:rsid w:val="00A90511"/>
+    <w:pPr>
+      <w:tabs>
+        <w:tab w:val="center" w:pos="4536"/>
+        <w:tab w:val="right" w:pos="9072"/>
+      </w:tabs>
+    </w:pPr>
+  </w:style>
+  <w:style w:type="character" w:customStyle="1" w:styleId="AltBilgiChar">
+    <w:name w:val="Alt Bilgi Char"/>
+    <w:basedOn w:val="VarsaylanParagrafYazTipi"/>
+    <w:link w:val="AltBilgi"/>
+    <w:uiPriority w:val="99"/>
+    <w:rsid w:val="00A90511"/>
+  </w:style>
 </w:styles>
 </file>
 

</xml_diff>